<commit_message>
Actas de Sprint Review S0 y S1: espacio de firma para Agencia Cosmopolitan (Pía Mercado y Valentina Frías)
</commit_message>
<xml_diff>
--- a/Fase 2/Evidencias Proyecto/Evidencias de documentación/Sprint 0/Acta-Sprint-Review-S0.docx
+++ b/Fase 2/Evidencias Proyecto/Evidencias de documentación/Sprint 0/Acta-Sprint-Review-S0.docx
@@ -1695,6 +1695,183 @@
                 <w:rFonts w:ascii="Arial" w:hAnsi="Arial" w:eastAsia="Arial"/>
               </w:rPr>
               <w:t>Developer</w:t>
+            </w:r>
+          </w:p>
+        </w:tc>
+      </w:tr>
+    </w:tbl>
+    <w:p>
+      <w:pPr>
+        <w:keepNext/>
+        <w:spacing w:after="60" w:before="360"/>
+        <w:jc w:val="center"/>
+      </w:pPr>
+      <w:r>
+        <w:rPr>
+          <w:rFonts w:ascii="Arial" w:hAnsi="Arial"/>
+          <w:b/>
+          <w:sz w:val="20"/>
+        </w:rPr>
+        <w:t>Validación de Agencia Cosmopolitan</w:t>
+      </w:r>
+    </w:p>
+    <w:tbl>
+      <w:tblPr>
+        <w:tblW w:type="dxa" w:w="9026"/>
+        <w:tblBorders>
+          <w:top w:val="single" w:color="auto" w:sz="4"/>
+          <w:left w:val="single" w:color="auto" w:sz="4"/>
+          <w:bottom w:val="single" w:color="auto" w:sz="4"/>
+          <w:right w:val="single" w:color="auto" w:sz="4"/>
+          <w:insideH w:val="single" w:color="auto" w:sz="4"/>
+          <w:insideV w:val="single" w:color="auto" w:sz="4"/>
+        </w:tblBorders>
+      </w:tblPr>
+      <w:tblGrid>
+        <w:gridCol w:w="3008"/>
+        <w:gridCol w:w="3008"/>
+      </w:tblGrid>
+      <w:tr>
+        <w:trPr>
+          <w:cantSplit/>
+        </w:trPr>
+        <w:tc>
+          <w:tcPr>
+            <w:tcW w:type="dxa" w:w="3008"/>
+            <w:tcBorders>
+              <w:top w:val="none" w:color="FFFFFF" w:sz="0"/>
+              <w:left w:val="none" w:color="FFFFFF" w:sz="0"/>
+              <w:bottom w:val="none" w:color="FFFFFF" w:sz="0"/>
+              <w:right w:val="none" w:color="FFFFFF" w:sz="0"/>
+            </w:tcBorders>
+          </w:tcPr>
+          <w:p>
+            <w:pPr>
+              <w:keepNext/>
+              <w:keepLines/>
+              <w:spacing w:before="360"/>
+              <w:jc w:val="center"/>
+            </w:pPr>
+            <w:r>
+              <w:rPr>
+                <w:rFonts w:ascii="Segoe Script" w:hAnsi="Segoe Script" w:eastAsia="Segoe Script"/>
+                <w:b w:val="0"/>
+                <w:i w:val="0"/>
+                <w:sz w:val="26"/>
+              </w:rPr>
+              <w:t xml:space="preserve"> </w:t>
+            </w:r>
+          </w:p>
+          <w:p>
+            <w:pPr>
+              <w:keepNext/>
+              <w:keepLines/>
+              <w:jc w:val="center"/>
+            </w:pPr>
+            <w:r>
+              <w:rPr>
+                <w:rFonts w:ascii="Arial" w:hAnsi="Arial" w:eastAsia="Arial"/>
+              </w:rPr>
+              <w:t>______________________</w:t>
+            </w:r>
+          </w:p>
+          <w:p>
+            <w:pPr>
+              <w:keepNext/>
+              <w:keepLines/>
+              <w:jc w:val="center"/>
+            </w:pPr>
+            <w:r>
+              <w:rPr>
+                <w:rFonts w:ascii="Arial" w:hAnsi="Arial" w:eastAsia="Arial"/>
+                <w:b/>
+                <w:i w:val="0"/>
+              </w:rPr>
+              <w:t>Pía Mercado</w:t>
+            </w:r>
+          </w:p>
+          <w:p>
+            <w:pPr>
+              <w:keepLines/>
+              <w:jc w:val="center"/>
+            </w:pPr>
+            <w:r>
+              <w:rPr>
+                <w:rFonts w:ascii="Arial" w:hAnsi="Arial" w:eastAsia="Arial"/>
+                <w:b w:val="0"/>
+                <w:i w:val="0"/>
+              </w:rPr>
+              <w:t>Agencia Cosmopolitan</w:t>
+            </w:r>
+          </w:p>
+        </w:tc>
+        <w:tc>
+          <w:tcPr>
+            <w:tcW w:type="dxa" w:w="3008"/>
+            <w:tcBorders>
+              <w:top w:val="none" w:color="FFFFFF" w:sz="0"/>
+              <w:left w:val="none" w:color="FFFFFF" w:sz="0"/>
+              <w:bottom w:val="none" w:color="FFFFFF" w:sz="0"/>
+              <w:right w:val="none" w:color="FFFFFF" w:sz="0"/>
+            </w:tcBorders>
+          </w:tcPr>
+          <w:p>
+            <w:pPr>
+              <w:keepNext/>
+              <w:keepLines/>
+              <w:spacing w:before="360"/>
+              <w:jc w:val="center"/>
+            </w:pPr>
+            <w:r>
+              <w:rPr>
+                <w:rFonts w:ascii="Segoe Script" w:hAnsi="Segoe Script" w:eastAsia="Segoe Script"/>
+                <w:b w:val="0"/>
+                <w:i w:val="0"/>
+                <w:sz w:val="26"/>
+              </w:rPr>
+              <w:t xml:space="preserve"> </w:t>
+            </w:r>
+          </w:p>
+          <w:p>
+            <w:pPr>
+              <w:keepNext/>
+              <w:keepLines/>
+              <w:jc w:val="center"/>
+            </w:pPr>
+            <w:r>
+              <w:rPr>
+                <w:rFonts w:ascii="Arial" w:hAnsi="Arial" w:eastAsia="Arial"/>
+              </w:rPr>
+              <w:t>______________________</w:t>
+            </w:r>
+          </w:p>
+          <w:p>
+            <w:pPr>
+              <w:keepNext/>
+              <w:keepLines/>
+              <w:jc w:val="center"/>
+            </w:pPr>
+            <w:r>
+              <w:rPr>
+                <w:rFonts w:ascii="Arial" w:hAnsi="Arial" w:eastAsia="Arial"/>
+                <w:b/>
+                <w:i w:val="0"/>
+              </w:rPr>
+              <w:t>Valentina Frías</w:t>
+            </w:r>
+          </w:p>
+          <w:p>
+            <w:pPr>
+              <w:keepLines/>
+              <w:jc w:val="center"/>
+            </w:pPr>
+            <w:r>
+              <w:rPr>
+                <w:rFonts w:ascii="Arial" w:hAnsi="Arial" w:eastAsia="Arial"/>
+                <w:b w:val="0"/>
+                <w:i w:val="0"/>
+              </w:rPr>
+              <w:t>Agencia Cosmopolitan</w:t>
             </w:r>
           </w:p>
         </w:tc>

</xml_diff>